<commit_message>
Survey 1: bring every deliverable in line with the current manuscript
- Generate the Word supplement from supplement.tex with Mendeley citation
  fields (tables S1-S5, Fig. S1, 72-study evidence table); the previous
  Word supplement still described 58 studies and 149 references.
- Cover letter: 72 primary studies, 94 foundational works, 172
  references, quantum-execution tag, measured latency gap.
- tools/build_word.sh builds both Word files; the converter now handles
  the supplement's front matter and S-numbered tables and figures.
- Write O(sqrt N) in standard notation in the supplement.
- The zip package now contains every deliverable: LaTeX sources, both
  PDFs, both Word files, the cover letter, the CSV and the README.
</commit_message>
<xml_diff>
--- a/github/k/Survey1_CSUR_Cover_Letter.docx
+++ b/github/k/Survey1_CSUR_Cover_Letter.docx
@@ -57,7 +57,7 @@
         <w:rPr>
           <w:b w:val="0"/>
         </w:rPr>
-        <w:t>Quantum computing is often presented as a solution to the computational bottlenecks of autonomous robots, such as fleet scheduling, planning, localization, and learning. The literature, however, mixes asymptotic complexity results, noiseless simulations, small hardware runs, and quantum-inspired classical algorithms, so it is hard for researchers to judge what works today. Our survey addresses this problem. It reviews 58 primary studies, selected under the PRISMA 2020 guideline, against 91 foundational works (149 references, each checked against its publisher, DOI, or arXiv record). Its organizing contribution is a robotics-function taxonomy (optimization, planning, learning, sensing and communication, decision-making) combined with a six-level evidence hierarchy, from theoretical analysis to end-to-end deployment, that we apply to every study.</w:t>
+        <w:t>Quantum computing is often presented as a solution to the computational bottlenecks of autonomous robots, such as fleet scheduling, planning, localization, and learning. The literature, however, mixes asymptotic complexity results, noiseless simulations, small hardware runs, and quantum-inspired classical algorithms, so it is hard for researchers to judge what works today. Our survey addresses this problem. It reviews 72 primary studies published between 1998 and 2026, selected under the PRISMA 2020 guideline, against 94 foundational works (172 references, each checked against its publisher, DOI, or arXiv record). Its organizing contribution is a robotics-function taxonomy (optimization, planning, learning, sensing and communication, decision-making) combined with a six-level evidence hierarchy, from theoretical analysis to end-to-end deployment, that we apply to every study, together with a record of whether each study ran its quantum component on quantum hardware, in simulation, or not at all.</w:t>
       </w:r>
     </w:p>
     <w:p>
@@ -104,7 +104,7 @@
         <w:rPr>
           <w:b w:val="0"/>
         </w:rPr>
-        <w:t>• cloud latency, noise, and trainability keep quantum processors out of real-time control loops, and we quantify this latency gap;</w:t>
+        <w:t>• cloud latency, noise, and trainability keep quantum processors out of real-time control loops; we quantify this latency gap, and the first measurements, made on cart-pole control systems in 2025 and 2026, confirm it;</w:t>
       </w:r>
     </w:p>
     <w:p>
@@ -161,27 +161,24 @@
         <w:rPr>
           <w:b w:val="0"/>
         </w:rPr>
-        <w:t xml:space="preserve">The manuscript is prepared in the ACM acmsmall format. The online supplementary material contains the full data-extraction table (also as a CSV file), the PRISMA 2020 flow diagram and checklist, the quality-assessment rubric, and the search strings. The manuscript is original, has not been published previously, and is not under consideration elsewhere. All authors have approved the submission. </w:t>
+        <w:t>The manuscript is prepared in the ACM acmsmall format. The supplementary material contains the data-extraction table (also in machine-readable form), the PRISMA 2020 flow diagram and checklist, the appraisal criteria, and the search strings. The manuscript is original, has not been published previously, and is not under consideration elsewhere. All authors have approved the submission. [FILL: State any competing interests, or “The authors declare no competing interests.”] [FILL: Funding statement.]</w:t>
       </w:r>
       <w:r>
         <w:rPr>
           <w:b w:val="0"/>
           <w:highlight w:val="yellow"/>
         </w:rPr>
-        <w:t>[FILL: State any competing interests, or “The authors declare no competing interests.”]</w:t>
       </w:r>
       <w:r>
         <w:rPr>
           <w:b w:val="0"/>
         </w:rPr>
-        <w:t xml:space="preserve"> </w:t>
       </w:r>
       <w:r>
         <w:rPr>
           <w:b w:val="0"/>
           <w:highlight w:val="yellow"/>
         </w:rPr>
-        <w:t>[FILL: Funding statement.]</w:t>
       </w:r>
     </w:p>
     <w:p>

</xml_diff>

<commit_message>
Survey 1: copy-edit manuscript and cover letter for readability
Split long, semicolon-heavy sentences, vary recurring verdict phrasing,
and give the text a clearer authorial voice. No numbers, claims or
citations changed. Rebuilt the PDF, Word files and package zip.
</commit_message>
<xml_diff>
--- a/github/k/Survey1_CSUR_Cover_Letter.docx
+++ b/github/k/Survey1_CSUR_Cover_Letter.docx
@@ -46,7 +46,7 @@
         <w:rPr>
           <w:b w:val="0"/>
         </w:rPr>
-        <w:t>We submit our manuscript, “Quantum Technologies for Autonomous Robotics: A Systematic Survey of Methods, Evidence, and Deployment Constraints,” for consideration as a survey article in ACM Computing Surveys.</w:t>
+        <w:t>We are pleased to submit our manuscript, “Quantum Technologies for Autonomous Robotics: A Systematic Survey of Methods, Evidence, and Deployment Constraints,” for consideration as a survey article in ACM Computing Surveys.</w:t>
       </w:r>
     </w:p>
     <w:p>
@@ -57,7 +57,7 @@
         <w:rPr>
           <w:b w:val="0"/>
         </w:rPr>
-        <w:t>Quantum computing is often presented as a solution to the computational bottlenecks of autonomous robots, such as fleet scheduling, planning, localization, and learning. The literature, however, mixes asymptotic complexity results, noiseless simulations, small hardware runs, and quantum-inspired classical algorithms, so it is hard for researchers to judge what works today. Our survey addresses this problem. It reviews 72 primary studies published between 1998 and 2026, selected under the PRISMA 2020 guideline, against 104 foundational works (182 references, each checked against its publisher, DOI, or arXiv record). Its organizing contribution is a robotics-function taxonomy (optimization, planning, learning, sensing and communication, decision-making) combined with a six-level evidence hierarchy, from theoretical analysis to end-to-end deployment, that we apply to every study, together with a record of whether each study ran its quantum component on quantum hardware, in simulation, or not at all.</w:t>
+        <w:t>Quantum computing is often put forward as the answer to the hard computational problems of autonomous robots: fleet scheduling, planning, localization, and learning. When we began reading this literature, we found it difficult to tell what actually works. Asymptotic complexity results, noiseless simulations, small hardware runs, and quantum-inspired classical algorithms are reported side by side, often under the same “quantum” label. This survey is our attempt to sort them out. It reviews 72 primary studies published between 1998 and 2026, selected under the PRISMA 2020 guideline, against 104 foundational works (182 references, each checked against its publisher, DOI, or arXiv record). We organize the field by robotic function (optimization, planning, learning, sensing and communication, decision-making), grade every study on a six-level evidence hierarchy from theoretical analysis to end-to-end deployment, and record whether its quantum component ran on quantum hardware, in simulation, or not at all.</w:t>
       </w:r>
     </w:p>
     <w:p>
@@ -139,7 +139,7 @@
         <w:rPr>
           <w:b w:val="0"/>
         </w:rPr>
-        <w:t>The survey closes with open challenges derived from the taxonomy, a research agenda arranged by time horizon, and a reporting checklist for quantum-robotics experiments.</w:t>
+        <w:t>The survey ends with open challenges for each robotic function, a research agenda arranged by time horizon, and a reporting checklist that we hope future quantum-robotics experiments will adopt.</w:t>
       </w:r>
     </w:p>
     <w:p>
@@ -150,7 +150,7 @@
         <w:rPr>
           <w:b w:val="0"/>
         </w:rPr>
-        <w:t>The manuscript differs from earlier reviews of the area (Tandon et al., 2017; Petschnigg et al., 2019; Yan et al., 2024; Udekwe, 2025; Nigatu et al., 2026) in four ways: it grades the strength of evidence explicitly; it separates genuinely quantum from quantum-inspired results; it analyzes hardware, latency, and deployment constraints quantitatively; and it treats quantum sensing, communication, and quantum cognition as distinct routes to near-term impact. Table 1 of the manuscript sets out this comparison. We believe that the survey will interest the broad CSUR readership in robotics, quantum computing, and artificial intelligence.</w:t>
+        <w:t>The manuscript differs from earlier reviews of the area (Tandon et al., 2017; Petschnigg et al., 2019; Yan et al., 2024; Udekwe, 2025; Nigatu et al., 2026) in four ways. It grades the strength of evidence explicitly. It keeps genuinely quantum results apart from quantum-inspired ones. It analyzes hardware, latency, and deployment constraints quantitatively. And it treats quantum sensing, communication, and quantum cognition as separate routes to near-term impact. Table 1 of the manuscript sets out the comparison. We believe the survey will be useful to CSUR readers working in robotics, quantum computing, and artificial intelligence.</w:t>
       </w:r>
     </w:p>
     <w:p>

</xml_diff>

<commit_message>
Survey 1: add QPU-study table, resource estimate and appraisal matrix
- Table of the 22 studies run on quantum processors (device, instance,
  baseline, outcome) and a worked fault-tolerant resource estimate for
  Grover localization (new Section 11.6, Babbush 2018/2021 added).
- Justify the single evidence scale; soften the L6 claim in abstract,
  sensing section and conclusion.
- Expand sensing (aircraft-to-robot integration) and the research agenda
  (first experiments per function, priorities); trim cognition/emerging.
- Supplement Table S5 and quality_appraisal.csv: per-study appraisal
  (Q4, Q6 left for the authors).
- Fix float placement: all tables now precede the references.
- Counts updated to 106 foundational works and 184 references.
</commit_message>
<xml_diff>
--- a/github/k/Survey1_CSUR_Cover_Letter.docx
+++ b/github/k/Survey1_CSUR_Cover_Letter.docx
@@ -57,7 +57,7 @@
         <w:rPr>
           <w:b w:val="0"/>
         </w:rPr>
-        <w:t>Quantum computing is often put forward as the answer to the hard computational problems of autonomous robots: fleet scheduling, planning, localization, and learning. When we began reading this literature, we found it difficult to tell what actually works. Asymptotic complexity results, noiseless simulations, small hardware runs, and quantum-inspired classical algorithms are reported side by side, often under the same “quantum” label. This survey is our attempt to sort them out. It reviews 72 primary studies published between 1998 and 2026, selected under the PRISMA 2020 guideline, against 104 foundational works (182 references, each checked against its publisher, DOI, or arXiv record). We organize the field by robotic function (optimization, planning, learning, sensing and communication, decision-making), grade every study on a six-level evidence hierarchy from theoretical analysis to end-to-end deployment, and record whether its quantum component ran on quantum hardware, in simulation, or not at all.</w:t>
+        <w:t>Quantum computing is often put forward as the answer to the hard computational problems of autonomous robots: fleet scheduling, planning, localization, and learning. When we began reading this literature, we found it difficult to tell what actually works. Asymptotic complexity results, noiseless simulations, small hardware runs, and quantum-inspired classical algorithms are reported side by side, often under the same “quantum” label. This survey is our attempt to sort them out. It reviews 72 primary studies published between 1998 and 2026, selected under the PRISMA 2020 guideline, against 106 foundational works (184 references, each checked against its publisher, DOI, or arXiv record). We organize the field by robotic function (optimization, planning, learning, sensing and communication, decision-making), grade every study on a six-level evidence hierarchy from theoretical analysis to end-to-end deployment, and record whether its quantum component ran on quantum hardware, in simulation, or not at all.</w:t>
       </w:r>
     </w:p>
     <w:p>
@@ -116,7 +116,7 @@
         <w:rPr>
           <w:b w:val="0"/>
         </w:rPr>
-        <w:t>• quantum sensing and quantum communication are the only branches fielded on moving platforms; and</w:t>
+        <w:t>• quantum sensing and quantum communication are the only branches fielded on moving platforms, although the one field result showing a navigation advantage still awaits independent replication; and</w:t>
       </w:r>
     </w:p>
     <w:p>
@@ -139,7 +139,7 @@
         <w:rPr>
           <w:b w:val="0"/>
         </w:rPr>
-        <w:t>The survey ends with open challenges for each robotic function, a research agenda arranged by time horizon, and a reporting checklist that we hope future quantum-robotics experiments will adopt.</w:t>
+        <w:t>The survey ends with open challenges for each robotic function, a worked fault-tolerant resource estimate showing why a quadratic speed-up does not reach a localizing robot, a research agenda arranged by time horizon, and a reporting checklist that we hope future quantum-robotics experiments will adopt.</w:t>
       </w:r>
     </w:p>
     <w:p>

</xml_diff>